<commit_message>
docs: update Kickstarter deck, talking points, and video script deliverables
</commit_message>
<xml_diff>
--- a/deliverables/THOX_Talking_Points.docx
+++ b/deliverables/THOX_Talking_Points.docx
@@ -1707,7 +1707,7 @@
         <w:rPr>
           <w:color w:val="0A0E14"/>
         </w:rPr>
-        <w:t>Your AI, on silicon you own. (Tagline; opens every conversation.)</w:t>
+        <w:t>Your AI. Your Data. Your Rules. (Tagline; opens every conversation.)</w:t>
       </w:r>
     </w:p>
     <w:p>
@@ -1763,7 +1763,7 @@
           <w:sz w:val="20"/>
           <w:szCs w:val="20"/>
         </w:rPr>
-        <w:t>THOX.ai - Your AI, on silicon you own.</w:t>
+        <w:t>THOX.ai - Your AI. Your Data. Your Rules.</w:t>
       </w:r>
     </w:p>
     <w:sectPr>

</xml_diff>